<commit_message>
Update BSc.CSIT Third Sem
</commit_message>
<xml_diff>
--- a/Lab_Structure/front page.docx
+++ b/Lab_Structure/front page.docx
@@ -53,8 +53,36 @@
           <w:sz w:val="28"/>
           <w:szCs w:val="28"/>
         </w:rPr>
-        <w:t>Tilottama-5, Manigram, Rupandehi</w:t>
-      </w:r>
+        <w:t xml:space="preserve">Tilottama-5, </w:t>
+      </w:r>
+      <w:proofErr w:type="spellStart"/>
+      <w:r>
+        <w:rPr>
+          <w:rFonts w:ascii="Poppins" w:hAnsi="Poppins" w:cs="Poppins"/>
+          <w:sz w:val="28"/>
+          <w:szCs w:val="28"/>
+        </w:rPr>
+        <w:t>Manigram</w:t>
+      </w:r>
+      <w:proofErr w:type="spellEnd"/>
+      <w:r>
+        <w:rPr>
+          <w:rFonts w:ascii="Poppins" w:hAnsi="Poppins" w:cs="Poppins"/>
+          <w:sz w:val="28"/>
+          <w:szCs w:val="28"/>
+        </w:rPr>
+        <w:t xml:space="preserve">, </w:t>
+      </w:r>
+      <w:proofErr w:type="spellStart"/>
+      <w:r>
+        <w:rPr>
+          <w:rFonts w:ascii="Poppins" w:hAnsi="Poppins" w:cs="Poppins"/>
+          <w:sz w:val="28"/>
+          <w:szCs w:val="28"/>
+        </w:rPr>
+        <w:t>Rupandehi</w:t>
+      </w:r>
+      <w:proofErr w:type="spellEnd"/>
     </w:p>
     <w:p>
       <w:pPr>
@@ -133,19 +161,6 @@
         <w:t>Lab Report of "</w:t>
       </w:r>
       <w:r>
-        <w:rPr>
-          <w:rFonts w:ascii="Poppins" w:hAnsi="Poppins" w:cs="Poppins"/>
-          <w:sz w:val="28"/>
-          <w:szCs w:val="28"/>
-        </w:rPr>
-        <w:t>Numerical Method</w:t>
-      </w:r>
-      <w:r>
-        <w:rPr>
-          <w:rFonts w:ascii="Poppins" w:hAnsi="Poppins" w:cs="Poppins"/>
-          <w:sz w:val="28"/>
-          <w:szCs w:val="28"/>
-        </w:rPr>
         <w:t xml:space="preserve"> </w:t>
       </w:r>
       <w:r>
@@ -154,6 +169,22 @@
           <w:sz w:val="28"/>
           <w:szCs w:val="28"/>
         </w:rPr>
+        <w:t>Data Structure and Algorithm</w:t>
+      </w:r>
+      <w:r>
+        <w:rPr>
+          <w:rFonts w:ascii="Poppins" w:hAnsi="Poppins" w:cs="Poppins"/>
+          <w:sz w:val="28"/>
+          <w:szCs w:val="28"/>
+        </w:rPr>
+        <w:t xml:space="preserve"> </w:t>
+      </w:r>
+      <w:r>
+        <w:rPr>
+          <w:rFonts w:ascii="Poppins" w:hAnsi="Poppins" w:cs="Poppins"/>
+          <w:sz w:val="28"/>
+          <w:szCs w:val="28"/>
+        </w:rPr>
         <w:t>(</w:t>
       </w:r>
       <w:r>
@@ -170,7 +201,7 @@
           <w:sz w:val="28"/>
           <w:szCs w:val="28"/>
         </w:rPr>
-        <w:t>2</w:t>
+        <w:t>1</w:t>
       </w:r>
       <w:r>
         <w:rPr>
@@ -226,13 +257,23 @@
           <w:szCs w:val="28"/>
         </w:rPr>
       </w:pPr>
-      <w:r>
-        <w:rPr>
-          <w:rFonts w:ascii="Poppins" w:hAnsi="Poppins" w:cs="Poppins"/>
-          <w:sz w:val="28"/>
-          <w:szCs w:val="28"/>
-        </w:rPr>
-        <w:t>Kritipur Nepal</w:t>
+      <w:proofErr w:type="spellStart"/>
+      <w:r>
+        <w:rPr>
+          <w:rFonts w:ascii="Poppins" w:hAnsi="Poppins" w:cs="Poppins"/>
+          <w:sz w:val="28"/>
+          <w:szCs w:val="28"/>
+        </w:rPr>
+        <w:t>Kritipur</w:t>
+      </w:r>
+      <w:proofErr w:type="spellEnd"/>
+      <w:r>
+        <w:rPr>
+          <w:rFonts w:ascii="Poppins" w:hAnsi="Poppins" w:cs="Poppins"/>
+          <w:sz w:val="28"/>
+          <w:szCs w:val="28"/>
+        </w:rPr>
+        <w:t xml:space="preserve"> Nepal</w:t>
       </w:r>
     </w:p>
     <w:p>
@@ -278,7 +319,15 @@
           <w:sz w:val="28"/>
           <w:szCs w:val="28"/>
         </w:rPr>
-        <w:t>Name : Gaurav Gautam</w:t>
+        <w:t xml:space="preserve">Name : </w:t>
+      </w:r>
+      <w:r>
+        <w:rPr>
+          <w:rFonts w:ascii="Poppins" w:hAnsi="Poppins" w:cs="Poppins"/>
+          <w:sz w:val="28"/>
+          <w:szCs w:val="28"/>
+        </w:rPr>
+        <w:t>____________</w:t>
       </w:r>
     </w:p>
     <w:p>
@@ -336,7 +385,7 @@
           <w:sz w:val="28"/>
           <w:szCs w:val="28"/>
         </w:rPr>
-        <w:t>##</w:t>
+        <w:t>__</w:t>
       </w:r>
       <w:r>
         <w:rPr>
@@ -370,7 +419,7 @@
           <w:sz w:val="28"/>
           <w:szCs w:val="28"/>
         </w:rPr>
-        <w:t>##</w:t>
+        <w:t>__</w:t>
       </w:r>
     </w:p>
     <w:p>
@@ -410,13 +459,23 @@
           <w:szCs w:val="28"/>
         </w:rPr>
       </w:pPr>
-      <w:r>
-        <w:rPr>
-          <w:rFonts w:ascii="Poppins" w:hAnsi="Poppins" w:cs="Poppins"/>
-          <w:sz w:val="28"/>
-          <w:szCs w:val="28"/>
-        </w:rPr>
-        <w:t>Nepathya College</w:t>
+      <w:proofErr w:type="spellStart"/>
+      <w:r>
+        <w:rPr>
+          <w:rFonts w:ascii="Poppins" w:hAnsi="Poppins" w:cs="Poppins"/>
+          <w:sz w:val="28"/>
+          <w:szCs w:val="28"/>
+        </w:rPr>
+        <w:t>Nepathya</w:t>
+      </w:r>
+      <w:proofErr w:type="spellEnd"/>
+      <w:r>
+        <w:rPr>
+          <w:rFonts w:ascii="Poppins" w:hAnsi="Poppins" w:cs="Poppins"/>
+          <w:sz w:val="28"/>
+          <w:szCs w:val="28"/>
+        </w:rPr>
+        <w:t xml:space="preserve"> College</w:t>
       </w:r>
     </w:p>
     <w:p>
@@ -454,6 +513,2022 @@
         </w:rPr>
         <w:t>Tilottama-5, Nepal</w:t>
       </w:r>
+    </w:p>
+    <w:p>
+      <w:pPr>
+        <w:jc w:val="center"/>
+        <w:rPr>
+          <w:rFonts w:ascii="Poppins" w:hAnsi="Poppins" w:cs="Poppins"/>
+          <w:sz w:val="28"/>
+          <w:szCs w:val="28"/>
+        </w:rPr>
+      </w:pPr>
+    </w:p>
+    <w:p>
+      <w:pPr>
+        <w:jc w:val="center"/>
+        <w:rPr>
+          <w:rFonts w:ascii="Poppins" w:hAnsi="Poppins" w:cs="Poppins"/>
+          <w:sz w:val="36"/>
+          <w:szCs w:val="36"/>
+        </w:rPr>
+      </w:pPr>
+      <w:r>
+        <w:rPr>
+          <w:rFonts w:ascii="Poppins" w:hAnsi="Poppins" w:cs="Poppins"/>
+          <w:sz w:val="36"/>
+          <w:szCs w:val="36"/>
+        </w:rPr>
+        <w:lastRenderedPageBreak/>
+        <w:t>NEPATHYA COLLEGE</w:t>
+      </w:r>
+    </w:p>
+    <w:p>
+      <w:pPr>
+        <w:jc w:val="center"/>
+        <w:rPr>
+          <w:rFonts w:ascii="Poppins" w:hAnsi="Poppins" w:cs="Poppins"/>
+          <w:sz w:val="36"/>
+          <w:szCs w:val="36"/>
+        </w:rPr>
+      </w:pPr>
+      <w:r>
+        <w:rPr>
+          <w:rFonts w:ascii="Poppins" w:hAnsi="Poppins" w:cs="Poppins"/>
+          <w:sz w:val="36"/>
+          <w:szCs w:val="36"/>
+        </w:rPr>
+        <w:t>(Tribhuvan University)</w:t>
+      </w:r>
+    </w:p>
+    <w:p>
+      <w:pPr>
+        <w:jc w:val="center"/>
+        <w:rPr>
+          <w:rFonts w:ascii="Poppins" w:hAnsi="Poppins" w:cs="Poppins"/>
+          <w:sz w:val="28"/>
+          <w:szCs w:val="28"/>
+        </w:rPr>
+      </w:pPr>
+      <w:r>
+        <w:rPr>
+          <w:rFonts w:ascii="Poppins" w:hAnsi="Poppins" w:cs="Poppins"/>
+          <w:sz w:val="28"/>
+          <w:szCs w:val="28"/>
+        </w:rPr>
+        <w:t xml:space="preserve">Tilottama-5, </w:t>
+      </w:r>
+      <w:proofErr w:type="spellStart"/>
+      <w:r>
+        <w:rPr>
+          <w:rFonts w:ascii="Poppins" w:hAnsi="Poppins" w:cs="Poppins"/>
+          <w:sz w:val="28"/>
+          <w:szCs w:val="28"/>
+        </w:rPr>
+        <w:t>Manigram</w:t>
+      </w:r>
+      <w:proofErr w:type="spellEnd"/>
+      <w:r>
+        <w:rPr>
+          <w:rFonts w:ascii="Poppins" w:hAnsi="Poppins" w:cs="Poppins"/>
+          <w:sz w:val="28"/>
+          <w:szCs w:val="28"/>
+        </w:rPr>
+        <w:t xml:space="preserve">, </w:t>
+      </w:r>
+      <w:proofErr w:type="spellStart"/>
+      <w:r>
+        <w:rPr>
+          <w:rFonts w:ascii="Poppins" w:hAnsi="Poppins" w:cs="Poppins"/>
+          <w:sz w:val="28"/>
+          <w:szCs w:val="28"/>
+        </w:rPr>
+        <w:t>Rupandehi</w:t>
+      </w:r>
+      <w:proofErr w:type="spellEnd"/>
+    </w:p>
+    <w:p>
+      <w:pPr>
+        <w:jc w:val="center"/>
+        <w:rPr>
+          <w:rFonts w:ascii="Poppins" w:hAnsi="Poppins" w:cs="Poppins"/>
+          <w:sz w:val="28"/>
+          <w:szCs w:val="28"/>
+        </w:rPr>
+      </w:pPr>
+      <w:r>
+        <w:rPr>
+          <w:rFonts w:ascii="Poppins" w:hAnsi="Poppins" w:cs="Poppins"/>
+          <w:noProof/>
+          <w:sz w:val="28"/>
+          <w:szCs w:val="28"/>
+        </w:rPr>
+        <w:drawing>
+          <wp:inline distT="0" distB="0" distL="0" distR="0" wp14:anchorId="5769AD6D" wp14:editId="0C2F2031">
+            <wp:extent cx="2302933" cy="2141855"/>
+            <wp:effectExtent l="0" t="0" r="2540" b="0"/>
+            <wp:docPr id="599339955" name="Picture 1" descr="A star with a symbol and text&#10;&#10;AI-generated content may be incorrect."/>
+            <wp:cNvGraphicFramePr>
+              <a:graphicFrameLocks xmlns:a="http://schemas.openxmlformats.org/drawingml/2006/main" noChangeAspect="1"/>
+            </wp:cNvGraphicFramePr>
+            <a:graphic xmlns:a="http://schemas.openxmlformats.org/drawingml/2006/main">
+              <a:graphicData uri="http://schemas.openxmlformats.org/drawingml/2006/picture">
+                <pic:pic xmlns:pic="http://schemas.openxmlformats.org/drawingml/2006/picture">
+                  <pic:nvPicPr>
+                    <pic:cNvPr id="27318339" name="Picture 1" descr="A star with a symbol and text&#10;&#10;AI-generated content may be incorrect."/>
+                    <pic:cNvPicPr/>
+                  </pic:nvPicPr>
+                  <pic:blipFill>
+                    <a:blip r:embed="rId5">
+                      <a:extLst>
+                        <a:ext uri="{28A0092B-C50C-407E-A947-70E740481C1C}">
+                          <a14:useLocalDpi xmlns:a14="http://schemas.microsoft.com/office/drawing/2010/main" val="0"/>
+                        </a:ext>
+                      </a:extLst>
+                    </a:blip>
+                    <a:stretch>
+                      <a:fillRect/>
+                    </a:stretch>
+                  </pic:blipFill>
+                  <pic:spPr>
+                    <a:xfrm>
+                      <a:off x="0" y="0"/>
+                      <a:ext cx="2311591" cy="2149907"/>
+                    </a:xfrm>
+                    <a:prstGeom prst="rect">
+                      <a:avLst/>
+                    </a:prstGeom>
+                  </pic:spPr>
+                </pic:pic>
+              </a:graphicData>
+            </a:graphic>
+          </wp:inline>
+        </w:drawing>
+      </w:r>
+    </w:p>
+    <w:p>
+      <w:pPr>
+        <w:jc w:val="center"/>
+        <w:rPr>
+          <w:rFonts w:ascii="Poppins" w:hAnsi="Poppins" w:cs="Poppins"/>
+          <w:sz w:val="28"/>
+          <w:szCs w:val="28"/>
+        </w:rPr>
+      </w:pPr>
+      <w:r>
+        <w:rPr>
+          <w:rFonts w:ascii="Poppins" w:hAnsi="Poppins" w:cs="Poppins"/>
+          <w:sz w:val="28"/>
+          <w:szCs w:val="28"/>
+        </w:rPr>
+        <w:t>Lab Report of "</w:t>
+      </w:r>
+      <w:r>
+        <w:rPr>
+          <w:rFonts w:ascii="Poppins" w:hAnsi="Poppins" w:cs="Poppins"/>
+          <w:sz w:val="28"/>
+          <w:szCs w:val="28"/>
+        </w:rPr>
+        <w:t xml:space="preserve">Numerical Method </w:t>
+      </w:r>
+      <w:r>
+        <w:rPr>
+          <w:rFonts w:ascii="Poppins" w:hAnsi="Poppins" w:cs="Poppins"/>
+          <w:sz w:val="28"/>
+          <w:szCs w:val="28"/>
+        </w:rPr>
+        <w:t>(</w:t>
+      </w:r>
+      <w:r>
+        <w:rPr>
+          <w:rFonts w:ascii="Poppins" w:hAnsi="Poppins" w:cs="Poppins"/>
+          <w:sz w:val="28"/>
+          <w:szCs w:val="28"/>
+        </w:rPr>
+        <w:t>CSC 212</w:t>
+      </w:r>
+      <w:r>
+        <w:rPr>
+          <w:rFonts w:ascii="Poppins" w:hAnsi="Poppins" w:cs="Poppins"/>
+          <w:sz w:val="28"/>
+          <w:szCs w:val="28"/>
+        </w:rPr>
+        <w:t>)"</w:t>
+      </w:r>
+    </w:p>
+    <w:p>
+      <w:pPr>
+        <w:jc w:val="center"/>
+        <w:rPr>
+          <w:rFonts w:ascii="Poppins" w:hAnsi="Poppins" w:cs="Poppins"/>
+          <w:sz w:val="28"/>
+          <w:szCs w:val="28"/>
+        </w:rPr>
+      </w:pPr>
+      <w:r>
+        <w:rPr>
+          <w:rFonts w:ascii="Poppins" w:hAnsi="Poppins" w:cs="Poppins"/>
+          <w:sz w:val="28"/>
+          <w:szCs w:val="28"/>
+        </w:rPr>
+        <w:t>“Institute of Science &amp; Technology"</w:t>
+      </w:r>
+    </w:p>
+    <w:p>
+      <w:pPr>
+        <w:jc w:val="center"/>
+        <w:rPr>
+          <w:rFonts w:ascii="Poppins" w:hAnsi="Poppins" w:cs="Poppins"/>
+          <w:sz w:val="28"/>
+          <w:szCs w:val="28"/>
+        </w:rPr>
+      </w:pPr>
+      <w:r>
+        <w:rPr>
+          <w:rFonts w:ascii="Poppins" w:hAnsi="Poppins" w:cs="Poppins"/>
+          <w:sz w:val="28"/>
+          <w:szCs w:val="28"/>
+        </w:rPr>
+        <w:t>Tribhuvan University</w:t>
+      </w:r>
+    </w:p>
+    <w:p>
+      <w:pPr>
+        <w:jc w:val="center"/>
+        <w:rPr>
+          <w:rFonts w:ascii="Poppins" w:hAnsi="Poppins" w:cs="Poppins"/>
+          <w:sz w:val="28"/>
+          <w:szCs w:val="28"/>
+        </w:rPr>
+      </w:pPr>
+      <w:proofErr w:type="spellStart"/>
+      <w:r>
+        <w:rPr>
+          <w:rFonts w:ascii="Poppins" w:hAnsi="Poppins" w:cs="Poppins"/>
+          <w:sz w:val="28"/>
+          <w:szCs w:val="28"/>
+        </w:rPr>
+        <w:t>Kritipur</w:t>
+      </w:r>
+      <w:proofErr w:type="spellEnd"/>
+      <w:r>
+        <w:rPr>
+          <w:rFonts w:ascii="Poppins" w:hAnsi="Poppins" w:cs="Poppins"/>
+          <w:sz w:val="28"/>
+          <w:szCs w:val="28"/>
+        </w:rPr>
+        <w:t xml:space="preserve"> Nepal</w:t>
+      </w:r>
+    </w:p>
+    <w:p>
+      <w:pPr>
+        <w:jc w:val="center"/>
+        <w:rPr>
+          <w:rFonts w:ascii="Poppins" w:hAnsi="Poppins" w:cs="Poppins"/>
+          <w:sz w:val="28"/>
+          <w:szCs w:val="28"/>
+        </w:rPr>
+      </w:pPr>
+    </w:p>
+    <w:p>
+      <w:pPr>
+        <w:jc w:val="center"/>
+        <w:rPr>
+          <w:rFonts w:ascii="Poppins" w:hAnsi="Poppins" w:cs="Poppins"/>
+          <w:sz w:val="28"/>
+          <w:szCs w:val="28"/>
+        </w:rPr>
+      </w:pPr>
+      <w:r>
+        <w:rPr>
+          <w:rFonts w:ascii="Poppins" w:hAnsi="Poppins" w:cs="Poppins"/>
+          <w:sz w:val="28"/>
+          <w:szCs w:val="28"/>
+        </w:rPr>
+        <w:t>Submitted By</w:t>
+      </w:r>
+    </w:p>
+    <w:p>
+      <w:pPr>
+        <w:jc w:val="center"/>
+        <w:rPr>
+          <w:rFonts w:ascii="Poppins" w:hAnsi="Poppins" w:cs="Poppins"/>
+          <w:sz w:val="28"/>
+          <w:szCs w:val="28"/>
+        </w:rPr>
+      </w:pPr>
+      <w:r>
+        <w:rPr>
+          <w:rFonts w:ascii="Poppins" w:hAnsi="Poppins" w:cs="Poppins"/>
+          <w:sz w:val="28"/>
+          <w:szCs w:val="28"/>
+        </w:rPr>
+        <w:t xml:space="preserve">Name : </w:t>
+      </w:r>
+      <w:r>
+        <w:rPr>
+          <w:rFonts w:ascii="Poppins" w:hAnsi="Poppins" w:cs="Poppins"/>
+          <w:sz w:val="28"/>
+          <w:szCs w:val="28"/>
+        </w:rPr>
+        <w:t>____________</w:t>
+      </w:r>
+    </w:p>
+    <w:p>
+      <w:pPr>
+        <w:jc w:val="center"/>
+        <w:rPr>
+          <w:rFonts w:ascii="Poppins" w:hAnsi="Poppins" w:cs="Poppins"/>
+          <w:sz w:val="28"/>
+          <w:szCs w:val="28"/>
+        </w:rPr>
+      </w:pPr>
+      <w:r>
+        <w:rPr>
+          <w:rFonts w:ascii="Poppins" w:hAnsi="Poppins" w:cs="Poppins"/>
+          <w:sz w:val="28"/>
+          <w:szCs w:val="28"/>
+        </w:rPr>
+        <w:t>R</w:t>
+      </w:r>
+      <w:r>
+        <w:rPr>
+          <w:rFonts w:ascii="Poppins" w:hAnsi="Poppins" w:cs="Poppins"/>
+          <w:sz w:val="28"/>
+          <w:szCs w:val="28"/>
+        </w:rPr>
+        <w:t xml:space="preserve">egistration </w:t>
+      </w:r>
+      <w:r>
+        <w:rPr>
+          <w:rFonts w:ascii="Poppins" w:hAnsi="Poppins" w:cs="Poppins"/>
+          <w:sz w:val="28"/>
+          <w:szCs w:val="28"/>
+        </w:rPr>
+        <w:t>N</w:t>
+      </w:r>
+      <w:r>
+        <w:rPr>
+          <w:rFonts w:ascii="Poppins" w:hAnsi="Poppins" w:cs="Poppins"/>
+          <w:sz w:val="28"/>
+          <w:szCs w:val="28"/>
+        </w:rPr>
+        <w:t>umber</w:t>
+      </w:r>
+      <w:r>
+        <w:rPr>
+          <w:rFonts w:ascii="Poppins" w:hAnsi="Poppins" w:cs="Poppins"/>
+          <w:sz w:val="28"/>
+          <w:szCs w:val="28"/>
+        </w:rPr>
+        <w:t xml:space="preserve"> : 5-2-1182-__-2024</w:t>
+      </w:r>
+    </w:p>
+    <w:p>
+      <w:pPr>
+        <w:jc w:val="center"/>
+        <w:rPr>
+          <w:rFonts w:ascii="Poppins" w:hAnsi="Poppins" w:cs="Poppins"/>
+          <w:sz w:val="28"/>
+          <w:szCs w:val="28"/>
+        </w:rPr>
+      </w:pPr>
+      <w:r>
+        <w:rPr>
+          <w:rFonts w:ascii="Poppins" w:hAnsi="Poppins" w:cs="Poppins"/>
+          <w:sz w:val="28"/>
+          <w:szCs w:val="28"/>
+        </w:rPr>
+        <w:t xml:space="preserve">Roll No : </w:t>
+      </w:r>
+      <w:r>
+        <w:rPr>
+          <w:rFonts w:ascii="Poppins" w:hAnsi="Poppins" w:cs="Poppins"/>
+          <w:sz w:val="28"/>
+          <w:szCs w:val="28"/>
+        </w:rPr>
+        <w:t>__</w:t>
+      </w:r>
+    </w:p>
+    <w:p>
+      <w:pPr>
+        <w:jc w:val="center"/>
+        <w:rPr>
+          <w:rFonts w:ascii="Poppins" w:hAnsi="Poppins" w:cs="Poppins"/>
+          <w:sz w:val="28"/>
+          <w:szCs w:val="28"/>
+        </w:rPr>
+      </w:pPr>
+    </w:p>
+    <w:p>
+      <w:pPr>
+        <w:jc w:val="center"/>
+        <w:rPr>
+          <w:rFonts w:ascii="Poppins" w:hAnsi="Poppins" w:cs="Poppins"/>
+          <w:sz w:val="28"/>
+          <w:szCs w:val="28"/>
+        </w:rPr>
+      </w:pPr>
+      <w:r>
+        <w:rPr>
+          <w:rFonts w:ascii="Poppins" w:hAnsi="Poppins" w:cs="Poppins"/>
+          <w:sz w:val="28"/>
+          <w:szCs w:val="28"/>
+        </w:rPr>
+        <w:t>Submitted to</w:t>
+      </w:r>
+    </w:p>
+    <w:p>
+      <w:pPr>
+        <w:jc w:val="center"/>
+        <w:rPr>
+          <w:rFonts w:ascii="Poppins" w:hAnsi="Poppins" w:cs="Poppins"/>
+          <w:sz w:val="28"/>
+          <w:szCs w:val="28"/>
+        </w:rPr>
+      </w:pPr>
+      <w:proofErr w:type="spellStart"/>
+      <w:r>
+        <w:rPr>
+          <w:rFonts w:ascii="Poppins" w:hAnsi="Poppins" w:cs="Poppins"/>
+          <w:sz w:val="28"/>
+          <w:szCs w:val="28"/>
+        </w:rPr>
+        <w:t>Nepathya</w:t>
+      </w:r>
+      <w:proofErr w:type="spellEnd"/>
+      <w:r>
+        <w:rPr>
+          <w:rFonts w:ascii="Poppins" w:hAnsi="Poppins" w:cs="Poppins"/>
+          <w:sz w:val="28"/>
+          <w:szCs w:val="28"/>
+        </w:rPr>
+        <w:t xml:space="preserve"> College</w:t>
+      </w:r>
+    </w:p>
+    <w:p>
+      <w:pPr>
+        <w:jc w:val="center"/>
+        <w:rPr>
+          <w:rFonts w:ascii="Poppins" w:hAnsi="Poppins" w:cs="Poppins"/>
+          <w:sz w:val="28"/>
+          <w:szCs w:val="28"/>
+        </w:rPr>
+      </w:pPr>
+      <w:r>
+        <w:rPr>
+          <w:rFonts w:ascii="Poppins" w:hAnsi="Poppins" w:cs="Poppins"/>
+          <w:sz w:val="28"/>
+          <w:szCs w:val="28"/>
+        </w:rPr>
+        <w:t>Department of Computer Science and Information Technology</w:t>
+      </w:r>
+    </w:p>
+    <w:p>
+      <w:pPr>
+        <w:jc w:val="center"/>
+        <w:rPr>
+          <w:rFonts w:ascii="Poppins" w:hAnsi="Poppins" w:cs="Poppins"/>
+          <w:sz w:val="28"/>
+          <w:szCs w:val="28"/>
+        </w:rPr>
+      </w:pPr>
+      <w:r>
+        <w:rPr>
+          <w:rFonts w:ascii="Poppins" w:hAnsi="Poppins" w:cs="Poppins"/>
+          <w:sz w:val="28"/>
+          <w:szCs w:val="28"/>
+        </w:rPr>
+        <w:t>Tilottama-5, Nepal</w:t>
+      </w:r>
+    </w:p>
+    <w:p>
+      <w:pPr>
+        <w:jc w:val="center"/>
+        <w:rPr>
+          <w:rFonts w:ascii="Poppins" w:hAnsi="Poppins" w:cs="Poppins"/>
+          <w:sz w:val="28"/>
+          <w:szCs w:val="28"/>
+        </w:rPr>
+      </w:pPr>
+    </w:p>
+    <w:p>
+      <w:pPr>
+        <w:jc w:val="center"/>
+        <w:rPr>
+          <w:rFonts w:ascii="Poppins" w:hAnsi="Poppins" w:cs="Poppins"/>
+          <w:sz w:val="36"/>
+          <w:szCs w:val="36"/>
+        </w:rPr>
+      </w:pPr>
+      <w:r>
+        <w:rPr>
+          <w:rFonts w:ascii="Poppins" w:hAnsi="Poppins" w:cs="Poppins"/>
+          <w:sz w:val="36"/>
+          <w:szCs w:val="36"/>
+        </w:rPr>
+        <w:lastRenderedPageBreak/>
+        <w:t>NEPATHYA COLLEGE</w:t>
+      </w:r>
+    </w:p>
+    <w:p>
+      <w:pPr>
+        <w:jc w:val="center"/>
+        <w:rPr>
+          <w:rFonts w:ascii="Poppins" w:hAnsi="Poppins" w:cs="Poppins"/>
+          <w:sz w:val="36"/>
+          <w:szCs w:val="36"/>
+        </w:rPr>
+      </w:pPr>
+      <w:r>
+        <w:rPr>
+          <w:rFonts w:ascii="Poppins" w:hAnsi="Poppins" w:cs="Poppins"/>
+          <w:sz w:val="36"/>
+          <w:szCs w:val="36"/>
+        </w:rPr>
+        <w:t>(Tribhuvan University)</w:t>
+      </w:r>
+    </w:p>
+    <w:p>
+      <w:pPr>
+        <w:jc w:val="center"/>
+        <w:rPr>
+          <w:rFonts w:ascii="Poppins" w:hAnsi="Poppins" w:cs="Poppins"/>
+          <w:sz w:val="28"/>
+          <w:szCs w:val="28"/>
+        </w:rPr>
+      </w:pPr>
+      <w:r>
+        <w:rPr>
+          <w:rFonts w:ascii="Poppins" w:hAnsi="Poppins" w:cs="Poppins"/>
+          <w:sz w:val="28"/>
+          <w:szCs w:val="28"/>
+        </w:rPr>
+        <w:t xml:space="preserve">Tilottama-5, </w:t>
+      </w:r>
+      <w:proofErr w:type="spellStart"/>
+      <w:r>
+        <w:rPr>
+          <w:rFonts w:ascii="Poppins" w:hAnsi="Poppins" w:cs="Poppins"/>
+          <w:sz w:val="28"/>
+          <w:szCs w:val="28"/>
+        </w:rPr>
+        <w:t>Manigram</w:t>
+      </w:r>
+      <w:proofErr w:type="spellEnd"/>
+      <w:r>
+        <w:rPr>
+          <w:rFonts w:ascii="Poppins" w:hAnsi="Poppins" w:cs="Poppins"/>
+          <w:sz w:val="28"/>
+          <w:szCs w:val="28"/>
+        </w:rPr>
+        <w:t xml:space="preserve">, </w:t>
+      </w:r>
+      <w:proofErr w:type="spellStart"/>
+      <w:r>
+        <w:rPr>
+          <w:rFonts w:ascii="Poppins" w:hAnsi="Poppins" w:cs="Poppins"/>
+          <w:sz w:val="28"/>
+          <w:szCs w:val="28"/>
+        </w:rPr>
+        <w:t>Rupandehi</w:t>
+      </w:r>
+      <w:proofErr w:type="spellEnd"/>
+    </w:p>
+    <w:p>
+      <w:pPr>
+        <w:jc w:val="center"/>
+        <w:rPr>
+          <w:rFonts w:ascii="Poppins" w:hAnsi="Poppins" w:cs="Poppins"/>
+          <w:sz w:val="28"/>
+          <w:szCs w:val="28"/>
+        </w:rPr>
+      </w:pPr>
+      <w:r>
+        <w:rPr>
+          <w:rFonts w:ascii="Poppins" w:hAnsi="Poppins" w:cs="Poppins"/>
+          <w:noProof/>
+          <w:sz w:val="28"/>
+          <w:szCs w:val="28"/>
+        </w:rPr>
+        <w:drawing>
+          <wp:inline distT="0" distB="0" distL="0" distR="0" wp14:anchorId="57319F51" wp14:editId="25B9DDA3">
+            <wp:extent cx="2302933" cy="2141855"/>
+            <wp:effectExtent l="0" t="0" r="2540" b="0"/>
+            <wp:docPr id="217921403" name="Picture 1" descr="A star with a symbol and text&#10;&#10;AI-generated content may be incorrect."/>
+            <wp:cNvGraphicFramePr>
+              <a:graphicFrameLocks xmlns:a="http://schemas.openxmlformats.org/drawingml/2006/main" noChangeAspect="1"/>
+            </wp:cNvGraphicFramePr>
+            <a:graphic xmlns:a="http://schemas.openxmlformats.org/drawingml/2006/main">
+              <a:graphicData uri="http://schemas.openxmlformats.org/drawingml/2006/picture">
+                <pic:pic xmlns:pic="http://schemas.openxmlformats.org/drawingml/2006/picture">
+                  <pic:nvPicPr>
+                    <pic:cNvPr id="27318339" name="Picture 1" descr="A star with a symbol and text&#10;&#10;AI-generated content may be incorrect."/>
+                    <pic:cNvPicPr/>
+                  </pic:nvPicPr>
+                  <pic:blipFill>
+                    <a:blip r:embed="rId5">
+                      <a:extLst>
+                        <a:ext uri="{28A0092B-C50C-407E-A947-70E740481C1C}">
+                          <a14:useLocalDpi xmlns:a14="http://schemas.microsoft.com/office/drawing/2010/main" val="0"/>
+                        </a:ext>
+                      </a:extLst>
+                    </a:blip>
+                    <a:stretch>
+                      <a:fillRect/>
+                    </a:stretch>
+                  </pic:blipFill>
+                  <pic:spPr>
+                    <a:xfrm>
+                      <a:off x="0" y="0"/>
+                      <a:ext cx="2311591" cy="2149907"/>
+                    </a:xfrm>
+                    <a:prstGeom prst="rect">
+                      <a:avLst/>
+                    </a:prstGeom>
+                  </pic:spPr>
+                </pic:pic>
+              </a:graphicData>
+            </a:graphic>
+          </wp:inline>
+        </w:drawing>
+      </w:r>
+    </w:p>
+    <w:p>
+      <w:pPr>
+        <w:jc w:val="center"/>
+        <w:rPr>
+          <w:rFonts w:ascii="Poppins" w:hAnsi="Poppins" w:cs="Poppins"/>
+          <w:sz w:val="28"/>
+          <w:szCs w:val="28"/>
+        </w:rPr>
+      </w:pPr>
+      <w:r>
+        <w:rPr>
+          <w:rFonts w:ascii="Poppins" w:hAnsi="Poppins" w:cs="Poppins"/>
+          <w:sz w:val="28"/>
+          <w:szCs w:val="28"/>
+        </w:rPr>
+        <w:t>Lab Report of "</w:t>
+      </w:r>
+      <w:r>
+        <w:t xml:space="preserve"> </w:t>
+      </w:r>
+      <w:r>
+        <w:rPr>
+          <w:rFonts w:ascii="Poppins" w:hAnsi="Poppins" w:cs="Poppins"/>
+          <w:sz w:val="28"/>
+          <w:szCs w:val="28"/>
+        </w:rPr>
+        <w:t>Computer Architecture</w:t>
+      </w:r>
+      <w:r>
+        <w:rPr>
+          <w:rFonts w:ascii="Poppins" w:hAnsi="Poppins" w:cs="Poppins"/>
+          <w:sz w:val="28"/>
+          <w:szCs w:val="28"/>
+        </w:rPr>
+        <w:t xml:space="preserve"> </w:t>
+      </w:r>
+      <w:r>
+        <w:rPr>
+          <w:rFonts w:ascii="Poppins" w:hAnsi="Poppins" w:cs="Poppins"/>
+          <w:sz w:val="28"/>
+          <w:szCs w:val="28"/>
+        </w:rPr>
+        <w:t>(</w:t>
+      </w:r>
+      <w:r>
+        <w:rPr>
+          <w:rFonts w:ascii="Poppins" w:hAnsi="Poppins" w:cs="Poppins"/>
+          <w:sz w:val="28"/>
+          <w:szCs w:val="28"/>
+        </w:rPr>
+        <w:t>CSC 21</w:t>
+      </w:r>
+      <w:r>
+        <w:rPr>
+          <w:rFonts w:ascii="Poppins" w:hAnsi="Poppins" w:cs="Poppins"/>
+          <w:sz w:val="28"/>
+          <w:szCs w:val="28"/>
+        </w:rPr>
+        <w:t>3</w:t>
+      </w:r>
+      <w:r>
+        <w:rPr>
+          <w:rFonts w:ascii="Poppins" w:hAnsi="Poppins" w:cs="Poppins"/>
+          <w:sz w:val="28"/>
+          <w:szCs w:val="28"/>
+        </w:rPr>
+        <w:t>)"</w:t>
+      </w:r>
+    </w:p>
+    <w:p>
+      <w:pPr>
+        <w:jc w:val="center"/>
+        <w:rPr>
+          <w:rFonts w:ascii="Poppins" w:hAnsi="Poppins" w:cs="Poppins"/>
+          <w:sz w:val="28"/>
+          <w:szCs w:val="28"/>
+        </w:rPr>
+      </w:pPr>
+      <w:r>
+        <w:rPr>
+          <w:rFonts w:ascii="Poppins" w:hAnsi="Poppins" w:cs="Poppins"/>
+          <w:sz w:val="28"/>
+          <w:szCs w:val="28"/>
+        </w:rPr>
+        <w:t>“Institute of Science &amp; Technology"</w:t>
+      </w:r>
+    </w:p>
+    <w:p>
+      <w:pPr>
+        <w:jc w:val="center"/>
+        <w:rPr>
+          <w:rFonts w:ascii="Poppins" w:hAnsi="Poppins" w:cs="Poppins"/>
+          <w:sz w:val="28"/>
+          <w:szCs w:val="28"/>
+        </w:rPr>
+      </w:pPr>
+      <w:r>
+        <w:rPr>
+          <w:rFonts w:ascii="Poppins" w:hAnsi="Poppins" w:cs="Poppins"/>
+          <w:sz w:val="28"/>
+          <w:szCs w:val="28"/>
+        </w:rPr>
+        <w:t>Tribhuvan University</w:t>
+      </w:r>
+    </w:p>
+    <w:p>
+      <w:pPr>
+        <w:jc w:val="center"/>
+        <w:rPr>
+          <w:rFonts w:ascii="Poppins" w:hAnsi="Poppins" w:cs="Poppins"/>
+          <w:sz w:val="28"/>
+          <w:szCs w:val="28"/>
+        </w:rPr>
+      </w:pPr>
+      <w:proofErr w:type="spellStart"/>
+      <w:r>
+        <w:rPr>
+          <w:rFonts w:ascii="Poppins" w:hAnsi="Poppins" w:cs="Poppins"/>
+          <w:sz w:val="28"/>
+          <w:szCs w:val="28"/>
+        </w:rPr>
+        <w:t>Kritipur</w:t>
+      </w:r>
+      <w:proofErr w:type="spellEnd"/>
+      <w:r>
+        <w:rPr>
+          <w:rFonts w:ascii="Poppins" w:hAnsi="Poppins" w:cs="Poppins"/>
+          <w:sz w:val="28"/>
+          <w:szCs w:val="28"/>
+        </w:rPr>
+        <w:t xml:space="preserve"> Nepal</w:t>
+      </w:r>
+    </w:p>
+    <w:p>
+      <w:pPr>
+        <w:jc w:val="center"/>
+        <w:rPr>
+          <w:rFonts w:ascii="Poppins" w:hAnsi="Poppins" w:cs="Poppins"/>
+          <w:sz w:val="28"/>
+          <w:szCs w:val="28"/>
+        </w:rPr>
+      </w:pPr>
+    </w:p>
+    <w:p>
+      <w:pPr>
+        <w:jc w:val="center"/>
+        <w:rPr>
+          <w:rFonts w:ascii="Poppins" w:hAnsi="Poppins" w:cs="Poppins"/>
+          <w:sz w:val="28"/>
+          <w:szCs w:val="28"/>
+        </w:rPr>
+      </w:pPr>
+      <w:r>
+        <w:rPr>
+          <w:rFonts w:ascii="Poppins" w:hAnsi="Poppins" w:cs="Poppins"/>
+          <w:sz w:val="28"/>
+          <w:szCs w:val="28"/>
+        </w:rPr>
+        <w:t>Submitted By</w:t>
+      </w:r>
+    </w:p>
+    <w:p>
+      <w:pPr>
+        <w:jc w:val="center"/>
+        <w:rPr>
+          <w:rFonts w:ascii="Poppins" w:hAnsi="Poppins" w:cs="Poppins"/>
+          <w:sz w:val="28"/>
+          <w:szCs w:val="28"/>
+        </w:rPr>
+      </w:pPr>
+      <w:r>
+        <w:rPr>
+          <w:rFonts w:ascii="Poppins" w:hAnsi="Poppins" w:cs="Poppins"/>
+          <w:sz w:val="28"/>
+          <w:szCs w:val="28"/>
+        </w:rPr>
+        <w:t xml:space="preserve">Name : </w:t>
+      </w:r>
+      <w:r>
+        <w:rPr>
+          <w:rFonts w:ascii="Poppins" w:hAnsi="Poppins" w:cs="Poppins"/>
+          <w:sz w:val="28"/>
+          <w:szCs w:val="28"/>
+        </w:rPr>
+        <w:t>____________</w:t>
+      </w:r>
+    </w:p>
+    <w:p>
+      <w:pPr>
+        <w:jc w:val="center"/>
+        <w:rPr>
+          <w:rFonts w:ascii="Poppins" w:hAnsi="Poppins" w:cs="Poppins"/>
+          <w:sz w:val="28"/>
+          <w:szCs w:val="28"/>
+        </w:rPr>
+      </w:pPr>
+      <w:r>
+        <w:rPr>
+          <w:rFonts w:ascii="Poppins" w:hAnsi="Poppins" w:cs="Poppins"/>
+          <w:sz w:val="28"/>
+          <w:szCs w:val="28"/>
+        </w:rPr>
+        <w:t>R</w:t>
+      </w:r>
+      <w:r>
+        <w:rPr>
+          <w:rFonts w:ascii="Poppins" w:hAnsi="Poppins" w:cs="Poppins"/>
+          <w:sz w:val="28"/>
+          <w:szCs w:val="28"/>
+        </w:rPr>
+        <w:t xml:space="preserve">egistration </w:t>
+      </w:r>
+      <w:r>
+        <w:rPr>
+          <w:rFonts w:ascii="Poppins" w:hAnsi="Poppins" w:cs="Poppins"/>
+          <w:sz w:val="28"/>
+          <w:szCs w:val="28"/>
+        </w:rPr>
+        <w:t>N</w:t>
+      </w:r>
+      <w:r>
+        <w:rPr>
+          <w:rFonts w:ascii="Poppins" w:hAnsi="Poppins" w:cs="Poppins"/>
+          <w:sz w:val="28"/>
+          <w:szCs w:val="28"/>
+        </w:rPr>
+        <w:t>umber</w:t>
+      </w:r>
+      <w:r>
+        <w:rPr>
+          <w:rFonts w:ascii="Poppins" w:hAnsi="Poppins" w:cs="Poppins"/>
+          <w:sz w:val="28"/>
+          <w:szCs w:val="28"/>
+        </w:rPr>
+        <w:t xml:space="preserve"> : 5-2-1182-__-2024</w:t>
+      </w:r>
+    </w:p>
+    <w:p>
+      <w:pPr>
+        <w:jc w:val="center"/>
+        <w:rPr>
+          <w:rFonts w:ascii="Poppins" w:hAnsi="Poppins" w:cs="Poppins"/>
+          <w:sz w:val="28"/>
+          <w:szCs w:val="28"/>
+        </w:rPr>
+      </w:pPr>
+      <w:r>
+        <w:rPr>
+          <w:rFonts w:ascii="Poppins" w:hAnsi="Poppins" w:cs="Poppins"/>
+          <w:sz w:val="28"/>
+          <w:szCs w:val="28"/>
+        </w:rPr>
+        <w:t xml:space="preserve">Roll No : </w:t>
+      </w:r>
+      <w:r>
+        <w:rPr>
+          <w:rFonts w:ascii="Poppins" w:hAnsi="Poppins" w:cs="Poppins"/>
+          <w:sz w:val="28"/>
+          <w:szCs w:val="28"/>
+        </w:rPr>
+        <w:t>__</w:t>
+      </w:r>
+    </w:p>
+    <w:p>
+      <w:pPr>
+        <w:jc w:val="center"/>
+        <w:rPr>
+          <w:rFonts w:ascii="Poppins" w:hAnsi="Poppins" w:cs="Poppins"/>
+          <w:sz w:val="28"/>
+          <w:szCs w:val="28"/>
+        </w:rPr>
+      </w:pPr>
+    </w:p>
+    <w:p>
+      <w:pPr>
+        <w:jc w:val="center"/>
+        <w:rPr>
+          <w:rFonts w:ascii="Poppins" w:hAnsi="Poppins" w:cs="Poppins"/>
+          <w:sz w:val="28"/>
+          <w:szCs w:val="28"/>
+        </w:rPr>
+      </w:pPr>
+      <w:r>
+        <w:rPr>
+          <w:rFonts w:ascii="Poppins" w:hAnsi="Poppins" w:cs="Poppins"/>
+          <w:sz w:val="28"/>
+          <w:szCs w:val="28"/>
+        </w:rPr>
+        <w:t>Submitted to</w:t>
+      </w:r>
+    </w:p>
+    <w:p>
+      <w:pPr>
+        <w:jc w:val="center"/>
+        <w:rPr>
+          <w:rFonts w:ascii="Poppins" w:hAnsi="Poppins" w:cs="Poppins"/>
+          <w:sz w:val="28"/>
+          <w:szCs w:val="28"/>
+        </w:rPr>
+      </w:pPr>
+      <w:proofErr w:type="spellStart"/>
+      <w:r>
+        <w:rPr>
+          <w:rFonts w:ascii="Poppins" w:hAnsi="Poppins" w:cs="Poppins"/>
+          <w:sz w:val="28"/>
+          <w:szCs w:val="28"/>
+        </w:rPr>
+        <w:t>Nepathya</w:t>
+      </w:r>
+      <w:proofErr w:type="spellEnd"/>
+      <w:r>
+        <w:rPr>
+          <w:rFonts w:ascii="Poppins" w:hAnsi="Poppins" w:cs="Poppins"/>
+          <w:sz w:val="28"/>
+          <w:szCs w:val="28"/>
+        </w:rPr>
+        <w:t xml:space="preserve"> College</w:t>
+      </w:r>
+    </w:p>
+    <w:p>
+      <w:pPr>
+        <w:jc w:val="center"/>
+        <w:rPr>
+          <w:rFonts w:ascii="Poppins" w:hAnsi="Poppins" w:cs="Poppins"/>
+          <w:sz w:val="28"/>
+          <w:szCs w:val="28"/>
+        </w:rPr>
+      </w:pPr>
+      <w:r>
+        <w:rPr>
+          <w:rFonts w:ascii="Poppins" w:hAnsi="Poppins" w:cs="Poppins"/>
+          <w:sz w:val="28"/>
+          <w:szCs w:val="28"/>
+        </w:rPr>
+        <w:t>Department of Computer Science and Information Technology</w:t>
+      </w:r>
+    </w:p>
+    <w:p>
+      <w:pPr>
+        <w:jc w:val="center"/>
+        <w:rPr>
+          <w:rFonts w:ascii="Poppins" w:hAnsi="Poppins" w:cs="Poppins"/>
+          <w:sz w:val="28"/>
+          <w:szCs w:val="28"/>
+        </w:rPr>
+      </w:pPr>
+      <w:r>
+        <w:rPr>
+          <w:rFonts w:ascii="Poppins" w:hAnsi="Poppins" w:cs="Poppins"/>
+          <w:sz w:val="28"/>
+          <w:szCs w:val="28"/>
+        </w:rPr>
+        <w:t>Tilottama-5, Nepal</w:t>
+      </w:r>
+    </w:p>
+    <w:p>
+      <w:pPr>
+        <w:jc w:val="center"/>
+        <w:rPr>
+          <w:rFonts w:ascii="Poppins" w:hAnsi="Poppins" w:cs="Poppins"/>
+          <w:sz w:val="28"/>
+          <w:szCs w:val="28"/>
+        </w:rPr>
+      </w:pPr>
+    </w:p>
+    <w:p>
+      <w:pPr>
+        <w:jc w:val="center"/>
+        <w:rPr>
+          <w:rFonts w:ascii="Poppins" w:hAnsi="Poppins" w:cs="Poppins"/>
+          <w:sz w:val="36"/>
+          <w:szCs w:val="36"/>
+        </w:rPr>
+      </w:pPr>
+      <w:r>
+        <w:rPr>
+          <w:rFonts w:ascii="Poppins" w:hAnsi="Poppins" w:cs="Poppins"/>
+          <w:sz w:val="36"/>
+          <w:szCs w:val="36"/>
+        </w:rPr>
+        <w:lastRenderedPageBreak/>
+        <w:t>NEPATHYA COLLEGE</w:t>
+      </w:r>
+    </w:p>
+    <w:p>
+      <w:pPr>
+        <w:jc w:val="center"/>
+        <w:rPr>
+          <w:rFonts w:ascii="Poppins" w:hAnsi="Poppins" w:cs="Poppins"/>
+          <w:sz w:val="36"/>
+          <w:szCs w:val="36"/>
+        </w:rPr>
+      </w:pPr>
+      <w:r>
+        <w:rPr>
+          <w:rFonts w:ascii="Poppins" w:hAnsi="Poppins" w:cs="Poppins"/>
+          <w:sz w:val="36"/>
+          <w:szCs w:val="36"/>
+        </w:rPr>
+        <w:t>(Tribhuvan University)</w:t>
+      </w:r>
+    </w:p>
+    <w:p>
+      <w:pPr>
+        <w:jc w:val="center"/>
+        <w:rPr>
+          <w:rFonts w:ascii="Poppins" w:hAnsi="Poppins" w:cs="Poppins"/>
+          <w:sz w:val="28"/>
+          <w:szCs w:val="28"/>
+        </w:rPr>
+      </w:pPr>
+      <w:r>
+        <w:rPr>
+          <w:rFonts w:ascii="Poppins" w:hAnsi="Poppins" w:cs="Poppins"/>
+          <w:sz w:val="28"/>
+          <w:szCs w:val="28"/>
+        </w:rPr>
+        <w:t xml:space="preserve">Tilottama-5, </w:t>
+      </w:r>
+      <w:proofErr w:type="spellStart"/>
+      <w:r>
+        <w:rPr>
+          <w:rFonts w:ascii="Poppins" w:hAnsi="Poppins" w:cs="Poppins"/>
+          <w:sz w:val="28"/>
+          <w:szCs w:val="28"/>
+        </w:rPr>
+        <w:t>Manigram</w:t>
+      </w:r>
+      <w:proofErr w:type="spellEnd"/>
+      <w:r>
+        <w:rPr>
+          <w:rFonts w:ascii="Poppins" w:hAnsi="Poppins" w:cs="Poppins"/>
+          <w:sz w:val="28"/>
+          <w:szCs w:val="28"/>
+        </w:rPr>
+        <w:t xml:space="preserve">, </w:t>
+      </w:r>
+      <w:proofErr w:type="spellStart"/>
+      <w:r>
+        <w:rPr>
+          <w:rFonts w:ascii="Poppins" w:hAnsi="Poppins" w:cs="Poppins"/>
+          <w:sz w:val="28"/>
+          <w:szCs w:val="28"/>
+        </w:rPr>
+        <w:t>Rupandehi</w:t>
+      </w:r>
+      <w:proofErr w:type="spellEnd"/>
+    </w:p>
+    <w:p>
+      <w:pPr>
+        <w:jc w:val="center"/>
+        <w:rPr>
+          <w:rFonts w:ascii="Poppins" w:hAnsi="Poppins" w:cs="Poppins"/>
+          <w:sz w:val="28"/>
+          <w:szCs w:val="28"/>
+        </w:rPr>
+      </w:pPr>
+      <w:r>
+        <w:rPr>
+          <w:rFonts w:ascii="Poppins" w:hAnsi="Poppins" w:cs="Poppins"/>
+          <w:noProof/>
+          <w:sz w:val="28"/>
+          <w:szCs w:val="28"/>
+        </w:rPr>
+        <w:drawing>
+          <wp:inline distT="0" distB="0" distL="0" distR="0" wp14:anchorId="09CC8A4C" wp14:editId="06E23F4F">
+            <wp:extent cx="2302933" cy="2141855"/>
+            <wp:effectExtent l="0" t="0" r="2540" b="0"/>
+            <wp:docPr id="915483217" name="Picture 1" descr="A star with a symbol and text&#10;&#10;AI-generated content may be incorrect."/>
+            <wp:cNvGraphicFramePr>
+              <a:graphicFrameLocks xmlns:a="http://schemas.openxmlformats.org/drawingml/2006/main" noChangeAspect="1"/>
+            </wp:cNvGraphicFramePr>
+            <a:graphic xmlns:a="http://schemas.openxmlformats.org/drawingml/2006/main">
+              <a:graphicData uri="http://schemas.openxmlformats.org/drawingml/2006/picture">
+                <pic:pic xmlns:pic="http://schemas.openxmlformats.org/drawingml/2006/picture">
+                  <pic:nvPicPr>
+                    <pic:cNvPr id="27318339" name="Picture 1" descr="A star with a symbol and text&#10;&#10;AI-generated content may be incorrect."/>
+                    <pic:cNvPicPr/>
+                  </pic:nvPicPr>
+                  <pic:blipFill>
+                    <a:blip r:embed="rId5">
+                      <a:extLst>
+                        <a:ext uri="{28A0092B-C50C-407E-A947-70E740481C1C}">
+                          <a14:useLocalDpi xmlns:a14="http://schemas.microsoft.com/office/drawing/2010/main" val="0"/>
+                        </a:ext>
+                      </a:extLst>
+                    </a:blip>
+                    <a:stretch>
+                      <a:fillRect/>
+                    </a:stretch>
+                  </pic:blipFill>
+                  <pic:spPr>
+                    <a:xfrm>
+                      <a:off x="0" y="0"/>
+                      <a:ext cx="2311591" cy="2149907"/>
+                    </a:xfrm>
+                    <a:prstGeom prst="rect">
+                      <a:avLst/>
+                    </a:prstGeom>
+                  </pic:spPr>
+                </pic:pic>
+              </a:graphicData>
+            </a:graphic>
+          </wp:inline>
+        </w:drawing>
+      </w:r>
+    </w:p>
+    <w:p>
+      <w:pPr>
+        <w:jc w:val="center"/>
+        <w:rPr>
+          <w:rFonts w:ascii="Poppins" w:hAnsi="Poppins" w:cs="Poppins"/>
+          <w:sz w:val="28"/>
+          <w:szCs w:val="28"/>
+        </w:rPr>
+      </w:pPr>
+      <w:r>
+        <w:rPr>
+          <w:rFonts w:ascii="Poppins" w:hAnsi="Poppins" w:cs="Poppins"/>
+          <w:sz w:val="28"/>
+          <w:szCs w:val="28"/>
+        </w:rPr>
+        <w:t>Lab Report of "</w:t>
+      </w:r>
+      <w:r>
+        <w:t xml:space="preserve"> </w:t>
+      </w:r>
+      <w:r>
+        <w:rPr>
+          <w:rFonts w:ascii="Poppins" w:hAnsi="Poppins" w:cs="Poppins"/>
+          <w:sz w:val="28"/>
+          <w:szCs w:val="28"/>
+        </w:rPr>
+        <w:t>Compu</w:t>
+      </w:r>
+      <w:r>
+        <w:rPr>
+          <w:rFonts w:ascii="Poppins" w:hAnsi="Poppins" w:cs="Poppins"/>
+          <w:sz w:val="28"/>
+          <w:szCs w:val="28"/>
+        </w:rPr>
+        <w:t>ter Graphics</w:t>
+      </w:r>
+      <w:r>
+        <w:rPr>
+          <w:rFonts w:ascii="Poppins" w:hAnsi="Poppins" w:cs="Poppins"/>
+          <w:sz w:val="28"/>
+          <w:szCs w:val="28"/>
+        </w:rPr>
+        <w:t xml:space="preserve"> </w:t>
+      </w:r>
+      <w:r>
+        <w:rPr>
+          <w:rFonts w:ascii="Poppins" w:hAnsi="Poppins" w:cs="Poppins"/>
+          <w:sz w:val="28"/>
+          <w:szCs w:val="28"/>
+        </w:rPr>
+        <w:t>(</w:t>
+      </w:r>
+      <w:r>
+        <w:rPr>
+          <w:rFonts w:ascii="Poppins" w:hAnsi="Poppins" w:cs="Poppins"/>
+          <w:sz w:val="28"/>
+          <w:szCs w:val="28"/>
+        </w:rPr>
+        <w:t>CSC 21</w:t>
+      </w:r>
+      <w:r>
+        <w:rPr>
+          <w:rFonts w:ascii="Poppins" w:hAnsi="Poppins" w:cs="Poppins"/>
+          <w:sz w:val="28"/>
+          <w:szCs w:val="28"/>
+        </w:rPr>
+        <w:t>4</w:t>
+      </w:r>
+      <w:r>
+        <w:rPr>
+          <w:rFonts w:ascii="Poppins" w:hAnsi="Poppins" w:cs="Poppins"/>
+          <w:sz w:val="28"/>
+          <w:szCs w:val="28"/>
+        </w:rPr>
+        <w:t>)"</w:t>
+      </w:r>
+    </w:p>
+    <w:p>
+      <w:pPr>
+        <w:jc w:val="center"/>
+        <w:rPr>
+          <w:rFonts w:ascii="Poppins" w:hAnsi="Poppins" w:cs="Poppins"/>
+          <w:sz w:val="28"/>
+          <w:szCs w:val="28"/>
+        </w:rPr>
+      </w:pPr>
+      <w:r>
+        <w:rPr>
+          <w:rFonts w:ascii="Poppins" w:hAnsi="Poppins" w:cs="Poppins"/>
+          <w:sz w:val="28"/>
+          <w:szCs w:val="28"/>
+        </w:rPr>
+        <w:t>“Institute of Science &amp; Technology"</w:t>
+      </w:r>
+    </w:p>
+    <w:p>
+      <w:pPr>
+        <w:jc w:val="center"/>
+        <w:rPr>
+          <w:rFonts w:ascii="Poppins" w:hAnsi="Poppins" w:cs="Poppins"/>
+          <w:sz w:val="28"/>
+          <w:szCs w:val="28"/>
+        </w:rPr>
+      </w:pPr>
+      <w:r>
+        <w:rPr>
+          <w:rFonts w:ascii="Poppins" w:hAnsi="Poppins" w:cs="Poppins"/>
+          <w:sz w:val="28"/>
+          <w:szCs w:val="28"/>
+        </w:rPr>
+        <w:t>Tribhuvan University</w:t>
+      </w:r>
+    </w:p>
+    <w:p>
+      <w:pPr>
+        <w:jc w:val="center"/>
+        <w:rPr>
+          <w:rFonts w:ascii="Poppins" w:hAnsi="Poppins" w:cs="Poppins"/>
+          <w:sz w:val="28"/>
+          <w:szCs w:val="28"/>
+        </w:rPr>
+      </w:pPr>
+      <w:proofErr w:type="spellStart"/>
+      <w:r>
+        <w:rPr>
+          <w:rFonts w:ascii="Poppins" w:hAnsi="Poppins" w:cs="Poppins"/>
+          <w:sz w:val="28"/>
+          <w:szCs w:val="28"/>
+        </w:rPr>
+        <w:t>Kritipur</w:t>
+      </w:r>
+      <w:proofErr w:type="spellEnd"/>
+      <w:r>
+        <w:rPr>
+          <w:rFonts w:ascii="Poppins" w:hAnsi="Poppins" w:cs="Poppins"/>
+          <w:sz w:val="28"/>
+          <w:szCs w:val="28"/>
+        </w:rPr>
+        <w:t xml:space="preserve"> Nepal</w:t>
+      </w:r>
+    </w:p>
+    <w:p>
+      <w:pPr>
+        <w:jc w:val="center"/>
+        <w:rPr>
+          <w:rFonts w:ascii="Poppins" w:hAnsi="Poppins" w:cs="Poppins"/>
+          <w:sz w:val="28"/>
+          <w:szCs w:val="28"/>
+        </w:rPr>
+      </w:pPr>
+    </w:p>
+    <w:p>
+      <w:pPr>
+        <w:jc w:val="center"/>
+        <w:rPr>
+          <w:rFonts w:ascii="Poppins" w:hAnsi="Poppins" w:cs="Poppins"/>
+          <w:sz w:val="28"/>
+          <w:szCs w:val="28"/>
+        </w:rPr>
+      </w:pPr>
+      <w:r>
+        <w:rPr>
+          <w:rFonts w:ascii="Poppins" w:hAnsi="Poppins" w:cs="Poppins"/>
+          <w:sz w:val="28"/>
+          <w:szCs w:val="28"/>
+        </w:rPr>
+        <w:t>Submitted By</w:t>
+      </w:r>
+    </w:p>
+    <w:p>
+      <w:pPr>
+        <w:jc w:val="center"/>
+        <w:rPr>
+          <w:rFonts w:ascii="Poppins" w:hAnsi="Poppins" w:cs="Poppins"/>
+          <w:sz w:val="28"/>
+          <w:szCs w:val="28"/>
+        </w:rPr>
+      </w:pPr>
+      <w:r>
+        <w:rPr>
+          <w:rFonts w:ascii="Poppins" w:hAnsi="Poppins" w:cs="Poppins"/>
+          <w:sz w:val="28"/>
+          <w:szCs w:val="28"/>
+        </w:rPr>
+        <w:t xml:space="preserve">Name : </w:t>
+      </w:r>
+      <w:r>
+        <w:rPr>
+          <w:rFonts w:ascii="Poppins" w:hAnsi="Poppins" w:cs="Poppins"/>
+          <w:sz w:val="28"/>
+          <w:szCs w:val="28"/>
+        </w:rPr>
+        <w:t>____________</w:t>
+      </w:r>
+    </w:p>
+    <w:p>
+      <w:pPr>
+        <w:jc w:val="center"/>
+        <w:rPr>
+          <w:rFonts w:ascii="Poppins" w:hAnsi="Poppins" w:cs="Poppins"/>
+          <w:sz w:val="28"/>
+          <w:szCs w:val="28"/>
+        </w:rPr>
+      </w:pPr>
+      <w:r>
+        <w:rPr>
+          <w:rFonts w:ascii="Poppins" w:hAnsi="Poppins" w:cs="Poppins"/>
+          <w:sz w:val="28"/>
+          <w:szCs w:val="28"/>
+        </w:rPr>
+        <w:t>R</w:t>
+      </w:r>
+      <w:r>
+        <w:rPr>
+          <w:rFonts w:ascii="Poppins" w:hAnsi="Poppins" w:cs="Poppins"/>
+          <w:sz w:val="28"/>
+          <w:szCs w:val="28"/>
+        </w:rPr>
+        <w:t xml:space="preserve">egistration </w:t>
+      </w:r>
+      <w:r>
+        <w:rPr>
+          <w:rFonts w:ascii="Poppins" w:hAnsi="Poppins" w:cs="Poppins"/>
+          <w:sz w:val="28"/>
+          <w:szCs w:val="28"/>
+        </w:rPr>
+        <w:t>N</w:t>
+      </w:r>
+      <w:r>
+        <w:rPr>
+          <w:rFonts w:ascii="Poppins" w:hAnsi="Poppins" w:cs="Poppins"/>
+          <w:sz w:val="28"/>
+          <w:szCs w:val="28"/>
+        </w:rPr>
+        <w:t>umber</w:t>
+      </w:r>
+      <w:r>
+        <w:rPr>
+          <w:rFonts w:ascii="Poppins" w:hAnsi="Poppins" w:cs="Poppins"/>
+          <w:sz w:val="28"/>
+          <w:szCs w:val="28"/>
+        </w:rPr>
+        <w:t xml:space="preserve"> : 5-2-1182-__-2024</w:t>
+      </w:r>
+    </w:p>
+    <w:p>
+      <w:pPr>
+        <w:jc w:val="center"/>
+        <w:rPr>
+          <w:rFonts w:ascii="Poppins" w:hAnsi="Poppins" w:cs="Poppins"/>
+          <w:sz w:val="28"/>
+          <w:szCs w:val="28"/>
+        </w:rPr>
+      </w:pPr>
+      <w:r>
+        <w:rPr>
+          <w:rFonts w:ascii="Poppins" w:hAnsi="Poppins" w:cs="Poppins"/>
+          <w:sz w:val="28"/>
+          <w:szCs w:val="28"/>
+        </w:rPr>
+        <w:t xml:space="preserve">Roll No : </w:t>
+      </w:r>
+      <w:r>
+        <w:rPr>
+          <w:rFonts w:ascii="Poppins" w:hAnsi="Poppins" w:cs="Poppins"/>
+          <w:sz w:val="28"/>
+          <w:szCs w:val="28"/>
+        </w:rPr>
+        <w:t>__</w:t>
+      </w:r>
+    </w:p>
+    <w:p>
+      <w:pPr>
+        <w:jc w:val="center"/>
+        <w:rPr>
+          <w:rFonts w:ascii="Poppins" w:hAnsi="Poppins" w:cs="Poppins"/>
+          <w:sz w:val="28"/>
+          <w:szCs w:val="28"/>
+        </w:rPr>
+      </w:pPr>
+    </w:p>
+    <w:p>
+      <w:pPr>
+        <w:jc w:val="center"/>
+        <w:rPr>
+          <w:rFonts w:ascii="Poppins" w:hAnsi="Poppins" w:cs="Poppins"/>
+          <w:sz w:val="28"/>
+          <w:szCs w:val="28"/>
+        </w:rPr>
+      </w:pPr>
+      <w:r>
+        <w:rPr>
+          <w:rFonts w:ascii="Poppins" w:hAnsi="Poppins" w:cs="Poppins"/>
+          <w:sz w:val="28"/>
+          <w:szCs w:val="28"/>
+        </w:rPr>
+        <w:t>Submitted to</w:t>
+      </w:r>
+    </w:p>
+    <w:p>
+      <w:pPr>
+        <w:jc w:val="center"/>
+        <w:rPr>
+          <w:rFonts w:ascii="Poppins" w:hAnsi="Poppins" w:cs="Poppins"/>
+          <w:sz w:val="28"/>
+          <w:szCs w:val="28"/>
+        </w:rPr>
+      </w:pPr>
+      <w:proofErr w:type="spellStart"/>
+      <w:r>
+        <w:rPr>
+          <w:rFonts w:ascii="Poppins" w:hAnsi="Poppins" w:cs="Poppins"/>
+          <w:sz w:val="28"/>
+          <w:szCs w:val="28"/>
+        </w:rPr>
+        <w:t>Nepathya</w:t>
+      </w:r>
+      <w:proofErr w:type="spellEnd"/>
+      <w:r>
+        <w:rPr>
+          <w:rFonts w:ascii="Poppins" w:hAnsi="Poppins" w:cs="Poppins"/>
+          <w:sz w:val="28"/>
+          <w:szCs w:val="28"/>
+        </w:rPr>
+        <w:t xml:space="preserve"> College</w:t>
+      </w:r>
+    </w:p>
+    <w:p>
+      <w:pPr>
+        <w:jc w:val="center"/>
+        <w:rPr>
+          <w:rFonts w:ascii="Poppins" w:hAnsi="Poppins" w:cs="Poppins"/>
+          <w:sz w:val="28"/>
+          <w:szCs w:val="28"/>
+        </w:rPr>
+      </w:pPr>
+      <w:r>
+        <w:rPr>
+          <w:rFonts w:ascii="Poppins" w:hAnsi="Poppins" w:cs="Poppins"/>
+          <w:sz w:val="28"/>
+          <w:szCs w:val="28"/>
+        </w:rPr>
+        <w:t>Department of Computer Science and Information Technology</w:t>
+      </w:r>
+    </w:p>
+    <w:p>
+      <w:pPr>
+        <w:jc w:val="center"/>
+        <w:rPr>
+          <w:rFonts w:ascii="Poppins" w:hAnsi="Poppins" w:cs="Poppins"/>
+          <w:sz w:val="28"/>
+          <w:szCs w:val="28"/>
+        </w:rPr>
+      </w:pPr>
+      <w:r>
+        <w:rPr>
+          <w:rFonts w:ascii="Poppins" w:hAnsi="Poppins" w:cs="Poppins"/>
+          <w:sz w:val="28"/>
+          <w:szCs w:val="28"/>
+        </w:rPr>
+        <w:t>Tilottama-5, Nepal</w:t>
+      </w:r>
+    </w:p>
+    <w:p>
+      <w:pPr>
+        <w:jc w:val="center"/>
+        <w:rPr>
+          <w:rFonts w:ascii="Poppins" w:hAnsi="Poppins" w:cs="Poppins"/>
+          <w:sz w:val="28"/>
+          <w:szCs w:val="28"/>
+        </w:rPr>
+      </w:pPr>
+    </w:p>
+    <w:p>
+      <w:pPr>
+        <w:jc w:val="center"/>
+        <w:rPr>
+          <w:rFonts w:ascii="Poppins" w:hAnsi="Poppins" w:cs="Poppins"/>
+          <w:sz w:val="36"/>
+          <w:szCs w:val="36"/>
+        </w:rPr>
+      </w:pPr>
+      <w:r>
+        <w:rPr>
+          <w:rFonts w:ascii="Poppins" w:hAnsi="Poppins" w:cs="Poppins"/>
+          <w:sz w:val="36"/>
+          <w:szCs w:val="36"/>
+        </w:rPr>
+        <w:lastRenderedPageBreak/>
+        <w:t>NEPATHYA COLLEGE</w:t>
+      </w:r>
+    </w:p>
+    <w:p>
+      <w:pPr>
+        <w:jc w:val="center"/>
+        <w:rPr>
+          <w:rFonts w:ascii="Poppins" w:hAnsi="Poppins" w:cs="Poppins"/>
+          <w:sz w:val="36"/>
+          <w:szCs w:val="36"/>
+        </w:rPr>
+      </w:pPr>
+      <w:r>
+        <w:rPr>
+          <w:rFonts w:ascii="Poppins" w:hAnsi="Poppins" w:cs="Poppins"/>
+          <w:sz w:val="36"/>
+          <w:szCs w:val="36"/>
+        </w:rPr>
+        <w:t>(Tribhuvan University)</w:t>
+      </w:r>
+    </w:p>
+    <w:p>
+      <w:pPr>
+        <w:jc w:val="center"/>
+        <w:rPr>
+          <w:rFonts w:ascii="Poppins" w:hAnsi="Poppins" w:cs="Poppins"/>
+          <w:sz w:val="28"/>
+          <w:szCs w:val="28"/>
+        </w:rPr>
+      </w:pPr>
+      <w:r>
+        <w:rPr>
+          <w:rFonts w:ascii="Poppins" w:hAnsi="Poppins" w:cs="Poppins"/>
+          <w:sz w:val="28"/>
+          <w:szCs w:val="28"/>
+        </w:rPr>
+        <w:t xml:space="preserve">Tilottama-5, </w:t>
+      </w:r>
+      <w:proofErr w:type="spellStart"/>
+      <w:r>
+        <w:rPr>
+          <w:rFonts w:ascii="Poppins" w:hAnsi="Poppins" w:cs="Poppins"/>
+          <w:sz w:val="28"/>
+          <w:szCs w:val="28"/>
+        </w:rPr>
+        <w:t>Manigram</w:t>
+      </w:r>
+      <w:proofErr w:type="spellEnd"/>
+      <w:r>
+        <w:rPr>
+          <w:rFonts w:ascii="Poppins" w:hAnsi="Poppins" w:cs="Poppins"/>
+          <w:sz w:val="28"/>
+          <w:szCs w:val="28"/>
+        </w:rPr>
+        <w:t xml:space="preserve">, </w:t>
+      </w:r>
+      <w:proofErr w:type="spellStart"/>
+      <w:r>
+        <w:rPr>
+          <w:rFonts w:ascii="Poppins" w:hAnsi="Poppins" w:cs="Poppins"/>
+          <w:sz w:val="28"/>
+          <w:szCs w:val="28"/>
+        </w:rPr>
+        <w:t>Rupandehi</w:t>
+      </w:r>
+      <w:proofErr w:type="spellEnd"/>
+    </w:p>
+    <w:p>
+      <w:pPr>
+        <w:jc w:val="center"/>
+        <w:rPr>
+          <w:rFonts w:ascii="Poppins" w:hAnsi="Poppins" w:cs="Poppins"/>
+          <w:sz w:val="28"/>
+          <w:szCs w:val="28"/>
+        </w:rPr>
+      </w:pPr>
+      <w:r>
+        <w:rPr>
+          <w:rFonts w:ascii="Poppins" w:hAnsi="Poppins" w:cs="Poppins"/>
+          <w:noProof/>
+          <w:sz w:val="28"/>
+          <w:szCs w:val="28"/>
+        </w:rPr>
+        <w:drawing>
+          <wp:inline distT="0" distB="0" distL="0" distR="0" wp14:anchorId="7D698D11" wp14:editId="5555B558">
+            <wp:extent cx="2302933" cy="2141855"/>
+            <wp:effectExtent l="0" t="0" r="2540" b="0"/>
+            <wp:docPr id="621792329" name="Picture 1" descr="A star with a symbol and text&#10;&#10;AI-generated content may be incorrect."/>
+            <wp:cNvGraphicFramePr>
+              <a:graphicFrameLocks xmlns:a="http://schemas.openxmlformats.org/drawingml/2006/main" noChangeAspect="1"/>
+            </wp:cNvGraphicFramePr>
+            <a:graphic xmlns:a="http://schemas.openxmlformats.org/drawingml/2006/main">
+              <a:graphicData uri="http://schemas.openxmlformats.org/drawingml/2006/picture">
+                <pic:pic xmlns:pic="http://schemas.openxmlformats.org/drawingml/2006/picture">
+                  <pic:nvPicPr>
+                    <pic:cNvPr id="27318339" name="Picture 1" descr="A star with a symbol and text&#10;&#10;AI-generated content may be incorrect."/>
+                    <pic:cNvPicPr/>
+                  </pic:nvPicPr>
+                  <pic:blipFill>
+                    <a:blip r:embed="rId5">
+                      <a:extLst>
+                        <a:ext uri="{28A0092B-C50C-407E-A947-70E740481C1C}">
+                          <a14:useLocalDpi xmlns:a14="http://schemas.microsoft.com/office/drawing/2010/main" val="0"/>
+                        </a:ext>
+                      </a:extLst>
+                    </a:blip>
+                    <a:stretch>
+                      <a:fillRect/>
+                    </a:stretch>
+                  </pic:blipFill>
+                  <pic:spPr>
+                    <a:xfrm>
+                      <a:off x="0" y="0"/>
+                      <a:ext cx="2311591" cy="2149907"/>
+                    </a:xfrm>
+                    <a:prstGeom prst="rect">
+                      <a:avLst/>
+                    </a:prstGeom>
+                  </pic:spPr>
+                </pic:pic>
+              </a:graphicData>
+            </a:graphic>
+          </wp:inline>
+        </w:drawing>
+      </w:r>
+    </w:p>
+    <w:p>
+      <w:pPr>
+        <w:jc w:val="center"/>
+        <w:rPr>
+          <w:rFonts w:ascii="Poppins" w:hAnsi="Poppins" w:cs="Poppins"/>
+          <w:sz w:val="28"/>
+          <w:szCs w:val="28"/>
+        </w:rPr>
+      </w:pPr>
+      <w:r>
+        <w:rPr>
+          <w:rFonts w:ascii="Poppins" w:hAnsi="Poppins" w:cs="Poppins"/>
+          <w:sz w:val="28"/>
+          <w:szCs w:val="28"/>
+        </w:rPr>
+        <w:t>Lab Report of "</w:t>
+      </w:r>
+      <w:r>
+        <w:rPr>
+          <w:rFonts w:ascii="Poppins" w:hAnsi="Poppins" w:cs="Poppins"/>
+          <w:sz w:val="28"/>
+          <w:szCs w:val="28"/>
+        </w:rPr>
+        <w:t>Statistics-II</w:t>
+      </w:r>
+      <w:r>
+        <w:rPr>
+          <w:rFonts w:ascii="Poppins" w:hAnsi="Poppins" w:cs="Poppins"/>
+          <w:sz w:val="28"/>
+          <w:szCs w:val="28"/>
+        </w:rPr>
+        <w:t xml:space="preserve"> </w:t>
+      </w:r>
+      <w:r>
+        <w:rPr>
+          <w:rFonts w:ascii="Poppins" w:hAnsi="Poppins" w:cs="Poppins"/>
+          <w:sz w:val="28"/>
+          <w:szCs w:val="28"/>
+        </w:rPr>
+        <w:t>(</w:t>
+      </w:r>
+      <w:r>
+        <w:rPr>
+          <w:rFonts w:ascii="Poppins" w:hAnsi="Poppins" w:cs="Poppins"/>
+          <w:sz w:val="28"/>
+          <w:szCs w:val="28"/>
+        </w:rPr>
+        <w:t>STA 215</w:t>
+      </w:r>
+      <w:r>
+        <w:rPr>
+          <w:rFonts w:ascii="Poppins" w:hAnsi="Poppins" w:cs="Poppins"/>
+          <w:sz w:val="28"/>
+          <w:szCs w:val="28"/>
+        </w:rPr>
+        <w:t>)"</w:t>
+      </w:r>
+    </w:p>
+    <w:p>
+      <w:pPr>
+        <w:jc w:val="center"/>
+        <w:rPr>
+          <w:rFonts w:ascii="Poppins" w:hAnsi="Poppins" w:cs="Poppins"/>
+          <w:sz w:val="28"/>
+          <w:szCs w:val="28"/>
+        </w:rPr>
+      </w:pPr>
+      <w:r>
+        <w:rPr>
+          <w:rFonts w:ascii="Poppins" w:hAnsi="Poppins" w:cs="Poppins"/>
+          <w:sz w:val="28"/>
+          <w:szCs w:val="28"/>
+        </w:rPr>
+        <w:t>“Institute of Science &amp; Technology"</w:t>
+      </w:r>
+    </w:p>
+    <w:p>
+      <w:pPr>
+        <w:jc w:val="center"/>
+        <w:rPr>
+          <w:rFonts w:ascii="Poppins" w:hAnsi="Poppins" w:cs="Poppins"/>
+          <w:sz w:val="28"/>
+          <w:szCs w:val="28"/>
+        </w:rPr>
+      </w:pPr>
+      <w:r>
+        <w:rPr>
+          <w:rFonts w:ascii="Poppins" w:hAnsi="Poppins" w:cs="Poppins"/>
+          <w:sz w:val="28"/>
+          <w:szCs w:val="28"/>
+        </w:rPr>
+        <w:t>Tribhuvan University</w:t>
+      </w:r>
+    </w:p>
+    <w:p>
+      <w:pPr>
+        <w:jc w:val="center"/>
+        <w:rPr>
+          <w:rFonts w:ascii="Poppins" w:hAnsi="Poppins" w:cs="Poppins"/>
+          <w:sz w:val="28"/>
+          <w:szCs w:val="28"/>
+        </w:rPr>
+      </w:pPr>
+      <w:proofErr w:type="spellStart"/>
+      <w:r>
+        <w:rPr>
+          <w:rFonts w:ascii="Poppins" w:hAnsi="Poppins" w:cs="Poppins"/>
+          <w:sz w:val="28"/>
+          <w:szCs w:val="28"/>
+        </w:rPr>
+        <w:t>Kritipur</w:t>
+      </w:r>
+      <w:proofErr w:type="spellEnd"/>
+      <w:r>
+        <w:rPr>
+          <w:rFonts w:ascii="Poppins" w:hAnsi="Poppins" w:cs="Poppins"/>
+          <w:sz w:val="28"/>
+          <w:szCs w:val="28"/>
+        </w:rPr>
+        <w:t xml:space="preserve"> Nepal</w:t>
+      </w:r>
+    </w:p>
+    <w:p>
+      <w:pPr>
+        <w:jc w:val="center"/>
+        <w:rPr>
+          <w:rFonts w:ascii="Poppins" w:hAnsi="Poppins" w:cs="Poppins"/>
+          <w:sz w:val="28"/>
+          <w:szCs w:val="28"/>
+        </w:rPr>
+      </w:pPr>
+    </w:p>
+    <w:p>
+      <w:pPr>
+        <w:jc w:val="center"/>
+        <w:rPr>
+          <w:rFonts w:ascii="Poppins" w:hAnsi="Poppins" w:cs="Poppins"/>
+          <w:sz w:val="28"/>
+          <w:szCs w:val="28"/>
+        </w:rPr>
+      </w:pPr>
+      <w:r>
+        <w:rPr>
+          <w:rFonts w:ascii="Poppins" w:hAnsi="Poppins" w:cs="Poppins"/>
+          <w:sz w:val="28"/>
+          <w:szCs w:val="28"/>
+        </w:rPr>
+        <w:t>Submitted By</w:t>
+      </w:r>
+    </w:p>
+    <w:p>
+      <w:pPr>
+        <w:jc w:val="center"/>
+        <w:rPr>
+          <w:rFonts w:ascii="Poppins" w:hAnsi="Poppins" w:cs="Poppins"/>
+          <w:sz w:val="28"/>
+          <w:szCs w:val="28"/>
+        </w:rPr>
+      </w:pPr>
+      <w:r>
+        <w:rPr>
+          <w:rFonts w:ascii="Poppins" w:hAnsi="Poppins" w:cs="Poppins"/>
+          <w:sz w:val="28"/>
+          <w:szCs w:val="28"/>
+        </w:rPr>
+        <w:t xml:space="preserve">Name : </w:t>
+      </w:r>
+      <w:r>
+        <w:rPr>
+          <w:rFonts w:ascii="Poppins" w:hAnsi="Poppins" w:cs="Poppins"/>
+          <w:sz w:val="28"/>
+          <w:szCs w:val="28"/>
+        </w:rPr>
+        <w:t>____________</w:t>
+      </w:r>
+    </w:p>
+    <w:p>
+      <w:pPr>
+        <w:jc w:val="center"/>
+        <w:rPr>
+          <w:rFonts w:ascii="Poppins" w:hAnsi="Poppins" w:cs="Poppins"/>
+          <w:sz w:val="28"/>
+          <w:szCs w:val="28"/>
+        </w:rPr>
+      </w:pPr>
+      <w:r>
+        <w:rPr>
+          <w:rFonts w:ascii="Poppins" w:hAnsi="Poppins" w:cs="Poppins"/>
+          <w:sz w:val="28"/>
+          <w:szCs w:val="28"/>
+        </w:rPr>
+        <w:t>R</w:t>
+      </w:r>
+      <w:r>
+        <w:rPr>
+          <w:rFonts w:ascii="Poppins" w:hAnsi="Poppins" w:cs="Poppins"/>
+          <w:sz w:val="28"/>
+          <w:szCs w:val="28"/>
+        </w:rPr>
+        <w:t xml:space="preserve">egistration </w:t>
+      </w:r>
+      <w:r>
+        <w:rPr>
+          <w:rFonts w:ascii="Poppins" w:hAnsi="Poppins" w:cs="Poppins"/>
+          <w:sz w:val="28"/>
+          <w:szCs w:val="28"/>
+        </w:rPr>
+        <w:t>N</w:t>
+      </w:r>
+      <w:r>
+        <w:rPr>
+          <w:rFonts w:ascii="Poppins" w:hAnsi="Poppins" w:cs="Poppins"/>
+          <w:sz w:val="28"/>
+          <w:szCs w:val="28"/>
+        </w:rPr>
+        <w:t>umber</w:t>
+      </w:r>
+      <w:r>
+        <w:rPr>
+          <w:rFonts w:ascii="Poppins" w:hAnsi="Poppins" w:cs="Poppins"/>
+          <w:sz w:val="28"/>
+          <w:szCs w:val="28"/>
+        </w:rPr>
+        <w:t xml:space="preserve"> : 5-2-1182-__-2024</w:t>
+      </w:r>
+    </w:p>
+    <w:p>
+      <w:pPr>
+        <w:jc w:val="center"/>
+        <w:rPr>
+          <w:rFonts w:ascii="Poppins" w:hAnsi="Poppins" w:cs="Poppins"/>
+          <w:sz w:val="28"/>
+          <w:szCs w:val="28"/>
+        </w:rPr>
+      </w:pPr>
+      <w:r>
+        <w:rPr>
+          <w:rFonts w:ascii="Poppins" w:hAnsi="Poppins" w:cs="Poppins"/>
+          <w:sz w:val="28"/>
+          <w:szCs w:val="28"/>
+        </w:rPr>
+        <w:t xml:space="preserve">Roll No : </w:t>
+      </w:r>
+      <w:r>
+        <w:rPr>
+          <w:rFonts w:ascii="Poppins" w:hAnsi="Poppins" w:cs="Poppins"/>
+          <w:sz w:val="28"/>
+          <w:szCs w:val="28"/>
+        </w:rPr>
+        <w:t>__</w:t>
+      </w:r>
+    </w:p>
+    <w:p>
+      <w:pPr>
+        <w:jc w:val="center"/>
+        <w:rPr>
+          <w:rFonts w:ascii="Poppins" w:hAnsi="Poppins" w:cs="Poppins"/>
+          <w:sz w:val="28"/>
+          <w:szCs w:val="28"/>
+        </w:rPr>
+      </w:pPr>
+    </w:p>
+    <w:p>
+      <w:pPr>
+        <w:jc w:val="center"/>
+        <w:rPr>
+          <w:rFonts w:ascii="Poppins" w:hAnsi="Poppins" w:cs="Poppins"/>
+          <w:sz w:val="28"/>
+          <w:szCs w:val="28"/>
+        </w:rPr>
+      </w:pPr>
+      <w:r>
+        <w:rPr>
+          <w:rFonts w:ascii="Poppins" w:hAnsi="Poppins" w:cs="Poppins"/>
+          <w:sz w:val="28"/>
+          <w:szCs w:val="28"/>
+        </w:rPr>
+        <w:t>Submitted to</w:t>
+      </w:r>
+    </w:p>
+    <w:p>
+      <w:pPr>
+        <w:jc w:val="center"/>
+        <w:rPr>
+          <w:rFonts w:ascii="Poppins" w:hAnsi="Poppins" w:cs="Poppins"/>
+          <w:sz w:val="28"/>
+          <w:szCs w:val="28"/>
+        </w:rPr>
+      </w:pPr>
+      <w:proofErr w:type="spellStart"/>
+      <w:r>
+        <w:rPr>
+          <w:rFonts w:ascii="Poppins" w:hAnsi="Poppins" w:cs="Poppins"/>
+          <w:sz w:val="28"/>
+          <w:szCs w:val="28"/>
+        </w:rPr>
+        <w:t>Nepathya</w:t>
+      </w:r>
+      <w:proofErr w:type="spellEnd"/>
+      <w:r>
+        <w:rPr>
+          <w:rFonts w:ascii="Poppins" w:hAnsi="Poppins" w:cs="Poppins"/>
+          <w:sz w:val="28"/>
+          <w:szCs w:val="28"/>
+        </w:rPr>
+        <w:t xml:space="preserve"> College</w:t>
+      </w:r>
+    </w:p>
+    <w:p>
+      <w:pPr>
+        <w:jc w:val="center"/>
+        <w:rPr>
+          <w:rFonts w:ascii="Poppins" w:hAnsi="Poppins" w:cs="Poppins"/>
+          <w:sz w:val="28"/>
+          <w:szCs w:val="28"/>
+        </w:rPr>
+      </w:pPr>
+      <w:r>
+        <w:rPr>
+          <w:rFonts w:ascii="Poppins" w:hAnsi="Poppins" w:cs="Poppins"/>
+          <w:sz w:val="28"/>
+          <w:szCs w:val="28"/>
+        </w:rPr>
+        <w:t>Department of Computer Science and Information Technology</w:t>
+      </w:r>
+    </w:p>
+    <w:p>
+      <w:pPr>
+        <w:jc w:val="center"/>
+        <w:rPr>
+          <w:rFonts w:ascii="Poppins" w:hAnsi="Poppins" w:cs="Poppins"/>
+          <w:sz w:val="28"/>
+          <w:szCs w:val="28"/>
+        </w:rPr>
+      </w:pPr>
+      <w:r>
+        <w:rPr>
+          <w:rFonts w:ascii="Poppins" w:hAnsi="Poppins" w:cs="Poppins"/>
+          <w:sz w:val="28"/>
+          <w:szCs w:val="28"/>
+        </w:rPr>
+        <w:t>Tilottama-5, Nepal</w:t>
+      </w:r>
+    </w:p>
+    <w:p>
+      <w:pPr>
+        <w:jc w:val="center"/>
+        <w:rPr>
+          <w:rFonts w:ascii="Poppins" w:hAnsi="Poppins" w:cs="Poppins"/>
+          <w:sz w:val="28"/>
+          <w:szCs w:val="28"/>
+        </w:rPr>
+      </w:pPr>
     </w:p>
     <w:sectPr>
       <w:pgSz w:w="11906" w:h="16838" w:code="9"/>

</xml_diff>